<commit_message>
Include official SREC College Logo picture in report header across all reference Word documents
</commit_message>
<xml_diff>
--- a/docs/System_Constraints_and_Portal_Rules.docx
+++ b/docs/System_Constraints_and_Portal_Rules.docx
@@ -2,6 +2,46 @@
 <file path=word/document.xml><?xml version="1.0" encoding="utf-8"?>
 <w:document xmlns:wpc="http://schemas.microsoft.com/office/word/2010/wordprocessingCanvas" xmlns:mo="http://schemas.microsoft.com/office/mac/office/2008/main" xmlns:mc="http://schemas.openxmlformats.org/markup-compatibility/2006" xmlns:mv="urn:schemas-microsoft-com:mac:vml" xmlns:o="urn:schemas-microsoft-com:office:office" xmlns:r="http://schemas.openxmlformats.org/officeDocument/2006/relationships" xmlns:m="http://schemas.openxmlformats.org/officeDocument/2006/math" xmlns:v="urn:schemas-microsoft-com:vml" xmlns:wp14="http://schemas.microsoft.com/office/word/2010/wordprocessingDrawing" xmlns:wp="http://schemas.openxmlformats.org/drawingml/2006/wordprocessingDrawing" xmlns:w10="urn:schemas-microsoft-com:office:word" xmlns:w="http://schemas.openxmlformats.org/wordprocessingml/2006/main" xmlns:w14="http://schemas.microsoft.com/office/word/2010/wordml" xmlns:wpg="http://schemas.microsoft.com/office/word/2010/wordprocessingGroup" xmlns:wpi="http://schemas.microsoft.com/office/word/2010/wordprocessingInk" xmlns:wne="http://schemas.microsoft.com/office/word/2006/wordml" xmlns:wps="http://schemas.microsoft.com/office/word/2010/wordprocessingShape" mc:Ignorable="w14 wp14">
   <w:body>
+    <w:p>
+      <w:pPr>
+        <w:spacing w:before="0" w:after="80"/>
+        <w:jc w:val="center"/>
+      </w:pPr>
+      <w:r>
+        <w:drawing>
+          <wp:inline xmlns:a="http://schemas.openxmlformats.org/drawingml/2006/main" xmlns:pic="http://schemas.openxmlformats.org/drawingml/2006/picture">
+            <wp:extent cx="1645920" cy="519129"/>
+            <wp:docPr id="1" name="Picture 1"/>
+            <wp:cNvGraphicFramePr>
+              <a:graphicFrameLocks noChangeAspect="1"/>
+            </wp:cNvGraphicFramePr>
+            <a:graphic>
+              <a:graphicData uri="http://schemas.openxmlformats.org/drawingml/2006/picture">
+                <pic:pic>
+                  <pic:nvPicPr>
+                    <pic:cNvPr id="0" name="report-logo-left.png"/>
+                    <pic:cNvPicPr/>
+                  </pic:nvPicPr>
+                  <pic:blipFill>
+                    <a:blip r:embed="rId10"/>
+                    <a:stretch>
+                      <a:fillRect/>
+                    </a:stretch>
+                  </pic:blipFill>
+                  <pic:spPr>
+                    <a:xfrm>
+                      <a:off x="0" y="0"/>
+                      <a:ext cx="1645920" cy="519129"/>
+                    </a:xfrm>
+                    <a:prstGeom prst="rect"/>
+                  </pic:spPr>
+                </pic:pic>
+              </a:graphicData>
+            </a:graphic>
+          </wp:inline>
+        </w:drawing>
+      </w:r>
+    </w:p>
     <w:p>
       <w:pPr>
         <w:spacing w:before="0" w:after="40"/>

</xml_diff>

<commit_message>
Include dual logos (SREC College + SNR Sons Trust) and page borders across all reference Word documents
</commit_message>
<xml_diff>
--- a/docs/System_Constraints_and_Portal_Rules.docx
+++ b/docs/System_Constraints_and_Portal_Rules.docx
@@ -2,49 +2,113 @@
 <file path=word/document.xml><?xml version="1.0" encoding="utf-8"?>
 <w:document xmlns:wpc="http://schemas.microsoft.com/office/word/2010/wordprocessingCanvas" xmlns:mo="http://schemas.microsoft.com/office/mac/office/2008/main" xmlns:mc="http://schemas.openxmlformats.org/markup-compatibility/2006" xmlns:mv="urn:schemas-microsoft-com:mac:vml" xmlns:o="urn:schemas-microsoft-com:office:office" xmlns:r="http://schemas.openxmlformats.org/officeDocument/2006/relationships" xmlns:m="http://schemas.openxmlformats.org/officeDocument/2006/math" xmlns:v="urn:schemas-microsoft-com:vml" xmlns:wp14="http://schemas.microsoft.com/office/word/2010/wordprocessingDrawing" xmlns:wp="http://schemas.openxmlformats.org/drawingml/2006/wordprocessingDrawing" xmlns:w10="urn:schemas-microsoft-com:office:word" xmlns:w="http://schemas.openxmlformats.org/wordprocessingml/2006/main" xmlns:w14="http://schemas.microsoft.com/office/word/2010/wordml" xmlns:wpg="http://schemas.microsoft.com/office/word/2010/wordprocessingGroup" xmlns:wpi="http://schemas.microsoft.com/office/word/2010/wordprocessingInk" xmlns:wne="http://schemas.microsoft.com/office/word/2006/wordml" xmlns:wps="http://schemas.microsoft.com/office/word/2010/wordprocessingShape" mc:Ignorable="w14 wp14">
   <w:body>
+    <w:tbl>
+      <w:tblPr>
+        <w:tblW w:type="auto" w:w="0"/>
+        <w:jc w:val="center"/>
+        <w:tblLayout w:type="fixed"/>
+        <w:tblLook w:firstColumn="1" w:firstRow="1" w:lastColumn="0" w:lastRow="0" w:noHBand="0" w:noVBand="1" w:val="04A0"/>
+      </w:tblPr>
+      <w:tblGrid>
+        <w:gridCol w:w="5040"/>
+        <w:gridCol w:w="5040"/>
+      </w:tblGrid>
+      <w:tr>
+        <w:tc>
+          <w:tcPr>
+            <w:tcW w:type="dxa" w:w="5040"/>
+          </w:tcPr>
+          <w:p>
+            <w:pPr>
+              <w:spacing w:before="0" w:after="0"/>
+              <w:jc w:val="left"/>
+            </w:pPr>
+            <w:r>
+              <w:drawing>
+                <wp:inline xmlns:a="http://schemas.openxmlformats.org/drawingml/2006/main" xmlns:pic="http://schemas.openxmlformats.org/drawingml/2006/picture">
+                  <wp:extent cx="2464273" cy="777240"/>
+                  <wp:docPr id="1" name="Picture 1"/>
+                  <wp:cNvGraphicFramePr>
+                    <a:graphicFrameLocks noChangeAspect="1"/>
+                  </wp:cNvGraphicFramePr>
+                  <a:graphic>
+                    <a:graphicData uri="http://schemas.openxmlformats.org/drawingml/2006/picture">
+                      <pic:pic>
+                        <pic:nvPicPr>
+                          <pic:cNvPr id="0" name="report-logo-left.png"/>
+                          <pic:cNvPicPr/>
+                        </pic:nvPicPr>
+                        <pic:blipFill>
+                          <a:blip r:embed="rId10"/>
+                          <a:stretch>
+                            <a:fillRect/>
+                          </a:stretch>
+                        </pic:blipFill>
+                        <pic:spPr>
+                          <a:xfrm>
+                            <a:off x="0" y="0"/>
+                            <a:ext cx="2464273" cy="777240"/>
+                          </a:xfrm>
+                          <a:prstGeom prst="rect"/>
+                        </pic:spPr>
+                      </pic:pic>
+                    </a:graphicData>
+                  </a:graphic>
+                </wp:inline>
+              </w:drawing>
+            </w:r>
+          </w:p>
+        </w:tc>
+        <w:tc>
+          <w:tcPr>
+            <w:tcW w:type="dxa" w:w="5040"/>
+          </w:tcPr>
+          <w:p>
+            <w:pPr>
+              <w:spacing w:before="0" w:after="0"/>
+              <w:jc w:val="right"/>
+            </w:pPr>
+            <w:r>
+              <w:drawing>
+                <wp:inline xmlns:a="http://schemas.openxmlformats.org/drawingml/2006/main" xmlns:pic="http://schemas.openxmlformats.org/drawingml/2006/picture">
+                  <wp:extent cx="1044480" cy="777240"/>
+                  <wp:docPr id="2" name="Picture 2"/>
+                  <wp:cNvGraphicFramePr>
+                    <a:graphicFrameLocks noChangeAspect="1"/>
+                  </wp:cNvGraphicFramePr>
+                  <a:graphic>
+                    <a:graphicData uri="http://schemas.openxmlformats.org/drawingml/2006/picture">
+                      <pic:pic>
+                        <pic:nvPicPr>
+                          <pic:cNvPr id="0" name="report-logo-right.png"/>
+                          <pic:cNvPicPr/>
+                        </pic:nvPicPr>
+                        <pic:blipFill>
+                          <a:blip r:embed="rId11"/>
+                          <a:stretch>
+                            <a:fillRect/>
+                          </a:stretch>
+                        </pic:blipFill>
+                        <pic:spPr>
+                          <a:xfrm>
+                            <a:off x="0" y="0"/>
+                            <a:ext cx="1044480" cy="777240"/>
+                          </a:xfrm>
+                          <a:prstGeom prst="rect"/>
+                        </pic:spPr>
+                      </pic:pic>
+                    </a:graphicData>
+                  </a:graphic>
+                </wp:inline>
+              </w:drawing>
+            </w:r>
+          </w:p>
+        </w:tc>
+      </w:tr>
+    </w:tbl>
     <w:p>
       <w:pPr>
-        <w:spacing w:before="0" w:after="80"/>
-        <w:jc w:val="center"/>
-      </w:pPr>
-      <w:r>
-        <w:drawing>
-          <wp:inline xmlns:a="http://schemas.openxmlformats.org/drawingml/2006/main" xmlns:pic="http://schemas.openxmlformats.org/drawingml/2006/picture">
-            <wp:extent cx="1645920" cy="519129"/>
-            <wp:docPr id="1" name="Picture 1"/>
-            <wp:cNvGraphicFramePr>
-              <a:graphicFrameLocks noChangeAspect="1"/>
-            </wp:cNvGraphicFramePr>
-            <a:graphic>
-              <a:graphicData uri="http://schemas.openxmlformats.org/drawingml/2006/picture">
-                <pic:pic>
-                  <pic:nvPicPr>
-                    <pic:cNvPr id="0" name="report-logo-left.png"/>
-                    <pic:cNvPicPr/>
-                  </pic:nvPicPr>
-                  <pic:blipFill>
-                    <a:blip r:embed="rId10"/>
-                    <a:stretch>
-                      <a:fillRect/>
-                    </a:stretch>
-                  </pic:blipFill>
-                  <pic:spPr>
-                    <a:xfrm>
-                      <a:off x="0" y="0"/>
-                      <a:ext cx="1645920" cy="519129"/>
-                    </a:xfrm>
-                    <a:prstGeom prst="rect"/>
-                  </pic:spPr>
-                </pic:pic>
-              </a:graphicData>
-            </a:graphic>
-          </wp:inline>
-        </w:drawing>
-      </w:r>
-    </w:p>
-    <w:p>
-      <w:pPr>
-        <w:spacing w:before="0" w:after="40"/>
+        <w:spacing w:before="120" w:after="40"/>
         <w:jc w:val="center"/>
       </w:pPr>
       <w:r>
@@ -3003,6 +3067,12 @@
       <w:pgMar w:top="1080" w:right="1080" w:bottom="1080" w:left="1080" w:header="720" w:footer="720" w:gutter="0"/>
       <w:cols w:space="720"/>
       <w:docGrid w:linePitch="360"/>
+      <w:pgBorders w:offsetFrom="page">
+        <w:top w:val="single" w:sz="8" w:space="20" w:color="0F331F"/>
+        <w:left w:val="single" w:sz="8" w:space="20" w:color="0F331F"/>
+        <w:bottom w:val="single" w:sz="8" w:space="20" w:color="0F331F"/>
+        <w:right w:val="single" w:sz="8" w:space="20" w:color="0F331F"/>
+      </w:pgBorders>
     </w:sectPr>
   </w:body>
 </w:document>

</xml_diff>

<commit_message>
Clarify Club Coordination as Institutional Responsibility in FPI calculation
</commit_message>
<xml_diff>
--- a/docs/System_Constraints_and_Portal_Rules.docx
+++ b/docs/System_Constraints_and_Portal_Rules.docx
@@ -2877,6 +2877,28 @@
           <w:color w:val="0F331F"/>
           <w:sz w:val="28"/>
         </w:rPr>
+        <w:t xml:space="preserve">Club Coordinator &amp; Additional Responsibility Rule: </w:t>
+      </w:r>
+      <w:r>
+        <w:rPr>
+          <w:rFonts w:ascii="Times New Roman" w:hAnsi="Times New Roman"/>
+          <w:sz w:val="28"/>
+        </w:rPr>
+        <w:t>Being assigned as a Club Coordinator or Club In-charge is categorized as an Institutional Level Additional Responsibility under Criteria D1 in PART D (Institutional Development &amp; Contribution), scoring 10 Pts per institutional duty up to the 20 Pts Part D cap. Furthermore, student club activities organized by coordinators log extension points under PART B.</w:t>
+      </w:r>
+    </w:p>
+    <w:p>
+      <w:pPr>
+        <w:pStyle w:val="ListBullet"/>
+        <w:spacing w:after="80"/>
+      </w:pPr>
+      <w:r>
+        <w:rPr>
+          <w:rFonts w:ascii="Times New Roman" w:hAnsi="Times New Roman"/>
+          <w:b/>
+          <w:color w:val="0F331F"/>
+          <w:sz w:val="28"/>
+        </w:rPr>
         <w:t xml:space="preserve">Designation-Based Customization: </w:t>
       </w:r>
       <w:r>
@@ -3007,6 +3029,28 @@
           <w:color w:val="B91C1C"/>
           <w:sz w:val="28"/>
         </w:rPr>
+        <w:t xml:space="preserve">Dedicated Storage Folder Structure: </w:t>
+      </w:r>
+      <w:r>
+        <w:rPr>
+          <w:rFonts w:ascii="Times New Roman" w:hAnsi="Times New Roman"/>
+          <w:sz w:val="28"/>
+        </w:rPr>
+        <w:t>Uploaded documents are stored in dedicated faculty folders: server/SREC/{Department}/{Staff_ID}/, NOT in a common directory.</w:t>
+      </w:r>
+    </w:p>
+    <w:p>
+      <w:pPr>
+        <w:pStyle w:val="ListBullet"/>
+        <w:spacing w:after="80"/>
+      </w:pPr>
+      <w:r>
+        <w:rPr>
+          <w:rFonts w:ascii="Times New Roman" w:hAnsi="Times New Roman"/>
+          <w:b/>
+          <w:color w:val="B91C1C"/>
+          <w:sz w:val="28"/>
+        </w:rPr>
         <w:t xml:space="preserve">File Upload Size &amp; Formats: </w:t>
       </w:r>
       <w:r>
@@ -3037,28 +3081,6 @@
           <w:sz w:val="28"/>
         </w:rPr>
         <w:t>Direct file requests under /uploads/* or /SREC/* require valid JWT authentication via Authorization Bearer token header or ?token=&lt;token&gt; URL query string. Unauthenticated requests redirect to /login.</w:t>
-      </w:r>
-    </w:p>
-    <w:p>
-      <w:pPr>
-        <w:pStyle w:val="ListBullet"/>
-        <w:spacing w:after="80"/>
-      </w:pPr>
-      <w:r>
-        <w:rPr>
-          <w:rFonts w:ascii="Times New Roman" w:hAnsi="Times New Roman"/>
-          <w:b/>
-          <w:color w:val="B91C1C"/>
-          <w:sz w:val="28"/>
-        </w:rPr>
-        <w:t xml:space="preserve">Physical Folder Organization: </w:t>
-      </w:r>
-      <w:r>
-        <w:rPr>
-          <w:rFonts w:ascii="Times New Roman" w:hAnsi="Times New Roman"/>
-          <w:sz w:val="28"/>
-        </w:rPr>
-        <w:t>Documents are organized under /server/uploads/document/ or structured department directories /SREC/{Department}/{Staff_ID}/.</w:t>
       </w:r>
     </w:p>
     <w:sectPr>

</xml_diff>

<commit_message>
feat(v3.1): SREC FIS V3.1 Release — AI Batch Upload, Department PDF Compiler, FPI Part D, & score_c1 Appraisal Fix
</commit_message>
<xml_diff>
--- a/docs/System_Constraints_and_Portal_Rules.docx
+++ b/docs/System_Constraints_and_Portal_Rules.docx
@@ -82,7 +82,7 @@
           <w:color w:val="64748B"/>
           <w:sz w:val="22"/>
         </w:rPr>
-        <w:t>Document Generated: August 18, 2026 | Version 3.0 | Status: Active System Rules Specification</w:t>
+        <w:t>Document Generated: August 19, 2026 | Version 3.0 | Status: Active System Rules Specification</w:t>
       </w:r>
     </w:p>
     <w:p>
@@ -1028,6 +1028,28 @@
           <w:color w:val="0F331F"/>
           <w:sz w:val="28"/>
         </w:rPr>
+        <w:t xml:space="preserve">FPI Part D Scoring Formula &amp; Worked Examples: </w:t>
+      </w:r>
+      <w:r>
+        <w:rPr>
+          <w:rFonts w:ascii="Times New Roman" w:hAnsi="Times New Roman"/>
+          <w:sz w:val="28"/>
+        </w:rPr>
+        <w:t>Part D evaluates Institutional and Departmental contributions: Institutional Roles award 10.0 Pts per duty (Max 20.0 Pts); Departmental Roles award 10.0 Pts per duty (Max 10.0 Pts). Total Part D score is computed as: min(20.0, Institutional_Marks + Departmental_Marks). Worked Example A: Faculty serving as Club Coordinator (10 inst) + Dept Exam Cell Coordinator (10 dept) -&gt; 10 + 10 = 20.0 / 20.0 (Max Cap Reached). Worked Example B: Faculty holding 2 Institutional Roles (NSS Coordinator + Sports Advisory, 2 x 10 = 20 inst, 0 dept) -&gt; 20.0 / 20.0 (Max Cap Reached).</w:t>
+      </w:r>
+    </w:p>
+    <w:p>
+      <w:pPr>
+        <w:pStyle w:val="ListBullet"/>
+        <w:spacing w:after="80"/>
+      </w:pPr>
+      <w:r>
+        <w:rPr>
+          <w:rFonts w:ascii="Times New Roman" w:hAnsi="Times New Roman"/>
+          <w:b/>
+          <w:color w:val="0F331F"/>
+          <w:sz w:val="28"/>
+        </w:rPr>
         <w:t xml:space="preserve">Club Coordinator &amp; Co-Coordinator Rule: </w:t>
       </w:r>
       <w:r>
@@ -1249,6 +1271,65 @@
           <w:sz w:val="28"/>
         </w:rPr>
         <w:t>When a faculty member uploads a profile picture (JPG/PNG), the system automatically processes the image via AI portrait segmentation (rembg) to isolate the portrait and standardize the background to solid pure white (#FFFFFF) by default. This ensures uniform, professional presentation across all portals, ID cards, and official CV templates.</w:t>
+      </w:r>
+    </w:p>
+    <w:p>
+      <w:pPr>
+        <w:keepNext/>
+        <w:spacing w:before="320" w:after="120"/>
+      </w:pPr>
+      <w:r>
+        <w:rPr>
+          <w:rFonts w:ascii="Times New Roman" w:hAnsi="Times New Roman"/>
+          <w:b/>
+          <w:color w:val="0F172A"/>
+          <w:sz w:val="32"/>
+        </w:rPr>
+        <w:t>6. SREC FIS V3.1 Workflow Enhancements Governance &amp; Security</w:t>
+      </w:r>
+    </w:p>
+    <w:p>
+      <w:pPr>
+        <w:pStyle w:val="ListBullet"/>
+        <w:spacing w:after="80"/>
+      </w:pPr>
+      <w:r>
+        <w:rPr>
+          <w:rFonts w:ascii="Times New Roman" w:hAnsi="Times New Roman"/>
+          <w:b/>
+          <w:color w:val="0F331F"/>
+          <w:sz w:val="28"/>
+        </w:rPr>
+        <w:t xml:space="preserve">AI Batch Document Upload &amp; Concurrent Pre-Fill Pipeline (V3.1-01): </w:t>
+      </w:r>
+      <w:r>
+        <w:rPr>
+          <w:rFonts w:ascii="Times New Roman" w:hAnsi="Times New Roman"/>
+          <w:sz w:val="28"/>
+        </w:rPr>
+        <w:t>Faculty can upload up to 10 academic documents (Max 5 MB each, Max 20 MB total) across supported MIME types (PDF, JPG, PNG, WEBP). Employs a 2-worker queue concurrency to balance OCR and API rate limits. Partial failure resiliency ensures successful extractions are immediately reviewable while failed items offer retry/manual entry. In strict accordance with AI Non-Autonomy rules, zero unconfirmed records are auto-saved to database.</w:t>
+      </w:r>
+    </w:p>
+    <w:p>
+      <w:pPr>
+        <w:pStyle w:val="ListBullet"/>
+        <w:spacing w:after="80"/>
+      </w:pPr>
+      <w:r>
+        <w:rPr>
+          <w:rFonts w:ascii="Times New Roman" w:hAnsi="Times New Roman"/>
+          <w:b/>
+          <w:color w:val="0F331F"/>
+          <w:sz w:val="28"/>
+        </w:rPr>
+        <w:t xml:space="preserve">One-Click Consolidated Department Academic &amp; Accreditation PDF Compilation (V3.1-02): </w:t>
+      </w:r>
+      <w:r>
+        <w:rPr>
+          <w:rFonts w:ascii="Times New Roman" w:hAnsi="Times New Roman"/>
+          <w:sz w:val="28"/>
+        </w:rPr>
+        <w:t>Authorized HODs and Administrators can generate a consolidated 9-section official Department Performance &amp; Accreditation PDF in under 3.5 seconds. Strictly enforces department data isolation: HODs can only access their assigned department; cross-department attempts trigger HTTP 403 Forbidden. System Admin &amp; Principal retain institutional scope.</w:t>
       </w:r>
     </w:p>
     <w:sectPr>

</xml_diff>